<commit_message>
Filled out client meeting minutes
</commit_message>
<xml_diff>
--- a/CS 4800 - Captsone/Meeting Minutes/Client Meeting Minutes - 9-30-2025.docx
+++ b/CS 4800 - Captsone/Meeting Minutes/Client Meeting Minutes - 9-30-2025.docx
@@ -311,8 +311,17 @@
                 <w:sz w:val="20"/>
                 <w:szCs w:val="20"/>
               </w:rPr>
-              <w:t>Sameer Mankotia</w:t>
-            </w:r>
+              <w:t xml:space="preserve">Sameer </w:t>
+            </w:r>
+            <w:proofErr w:type="spellStart"/>
+            <w:r>
+              <w:rPr>
+                <w:sz w:val="20"/>
+                <w:szCs w:val="20"/>
+              </w:rPr>
+              <w:t>Mankotia</w:t>
+            </w:r>
+            <w:proofErr w:type="spellEnd"/>
           </w:p>
           <w:p>
             <w:pPr>
@@ -670,14 +679,30 @@
                 <w:sz w:val="20"/>
                 <w:szCs w:val="20"/>
               </w:rPr>
-              <w:t>Scheduling predictions</w:t>
-            </w:r>
-            <w:r>
-              <w:rPr>
-                <w:sz w:val="20"/>
-                <w:szCs w:val="20"/>
-              </w:rPr>
-              <w:t>; what happened to previous teams?</w:t>
+              <w:t xml:space="preserve">Scheduling </w:t>
+            </w:r>
+            <w:proofErr w:type="gramStart"/>
+            <w:r>
+              <w:rPr>
+                <w:sz w:val="20"/>
+                <w:szCs w:val="20"/>
+              </w:rPr>
+              <w:t>predictions</w:t>
+            </w:r>
+            <w:r>
+              <w:rPr>
+                <w:sz w:val="20"/>
+                <w:szCs w:val="20"/>
+              </w:rPr>
+              <w:t>;</w:t>
+            </w:r>
+            <w:proofErr w:type="gramEnd"/>
+            <w:r>
+              <w:rPr>
+                <w:sz w:val="20"/>
+                <w:szCs w:val="20"/>
+              </w:rPr>
+              <w:t xml:space="preserve"> what happened to previous teams?</w:t>
             </w:r>
           </w:p>
           <w:p>
@@ -735,7 +760,23 @@
                 <w:sz w:val="20"/>
                 <w:szCs w:val="20"/>
               </w:rPr>
-              <w:t>Budget Assignment; do we need to even do it?</w:t>
+              <w:t xml:space="preserve">Budget </w:t>
+            </w:r>
+            <w:proofErr w:type="gramStart"/>
+            <w:r>
+              <w:rPr>
+                <w:sz w:val="20"/>
+                <w:szCs w:val="20"/>
+              </w:rPr>
+              <w:t>Assignment;</w:t>
+            </w:r>
+            <w:proofErr w:type="gramEnd"/>
+            <w:r>
+              <w:rPr>
+                <w:sz w:val="20"/>
+                <w:szCs w:val="20"/>
+              </w:rPr>
+              <w:t xml:space="preserve"> do we need to even do it?</w:t>
             </w:r>
           </w:p>
           <w:p>
@@ -933,9 +974,21 @@
                 <w:szCs w:val="20"/>
               </w:rPr>
             </w:pPr>
-          </w:p>
-          <w:p>
-            <w:pPr>
+            <w:r>
+              <w:rPr>
+                <w:sz w:val="20"/>
+                <w:szCs w:val="20"/>
+              </w:rPr>
+              <w:t>Action Items:</w:t>
+            </w:r>
+          </w:p>
+          <w:p>
+            <w:pPr>
+              <w:pStyle w:val="ListParagraph"/>
+              <w:numPr>
+                <w:ilvl w:val="0"/>
+                <w:numId w:val="8"/>
+              </w:numPr>
               <w:shd w:val="clear" w:color="auto" w:fill="FFFFFF"/>
               <w:spacing w:line="240" w:lineRule="auto"/>
               <w:rPr>
@@ -943,9 +996,30 @@
                 <w:szCs w:val="20"/>
               </w:rPr>
             </w:pPr>
-          </w:p>
-          <w:p>
-            <w:pPr>
+            <w:r>
+              <w:rPr>
+                <w:sz w:val="20"/>
+                <w:szCs w:val="20"/>
+              </w:rPr>
+              <w:t xml:space="preserve">First initial upload for plugin onto </w:t>
+            </w:r>
+            <w:proofErr w:type="spellStart"/>
+            <w:r>
+              <w:rPr>
+                <w:sz w:val="20"/>
+                <w:szCs w:val="20"/>
+              </w:rPr>
+              <w:t>github</w:t>
+            </w:r>
+            <w:proofErr w:type="spellEnd"/>
+          </w:p>
+          <w:p>
+            <w:pPr>
+              <w:pStyle w:val="ListParagraph"/>
+              <w:numPr>
+                <w:ilvl w:val="0"/>
+                <w:numId w:val="8"/>
+              </w:numPr>
               <w:shd w:val="clear" w:color="auto" w:fill="FFFFFF"/>
               <w:spacing w:line="240" w:lineRule="auto"/>
               <w:rPr>
@@ -953,6 +1027,13 @@
                 <w:szCs w:val="20"/>
               </w:rPr>
             </w:pPr>
+            <w:r>
+              <w:rPr>
+                <w:sz w:val="20"/>
+                <w:szCs w:val="20"/>
+              </w:rPr>
+              <w:t>Successful plugin used</w:t>
+            </w:r>
           </w:p>
           <w:p>
             <w:pPr>
@@ -988,18 +1069,932 @@
           </w:p>
           <w:p>
             <w:pPr>
-              <w:numPr>
-                <w:ilvl w:val="0"/>
-                <w:numId w:val="5"/>
+              <w:pStyle w:val="ListParagraph"/>
+              <w:numPr>
+                <w:ilvl w:val="0"/>
+                <w:numId w:val="6"/>
               </w:numPr>
               <w:shd w:val="clear" w:color="auto" w:fill="FFFFFF"/>
               <w:spacing w:line="240" w:lineRule="auto"/>
               <w:rPr>
+                <w:sz w:val="20"/>
+                <w:szCs w:val="20"/>
+              </w:rPr>
+            </w:pPr>
+            <w:r>
+              <w:rPr>
+                <w:sz w:val="20"/>
+                <w:szCs w:val="20"/>
+              </w:rPr>
+              <w:t xml:space="preserve">DVP </w:t>
+            </w:r>
+          </w:p>
+          <w:p>
+            <w:pPr>
+              <w:pStyle w:val="ListParagraph"/>
+              <w:numPr>
+                <w:ilvl w:val="0"/>
+                <w:numId w:val="8"/>
+              </w:numPr>
+              <w:shd w:val="clear" w:color="auto" w:fill="FFFFFF"/>
+              <w:spacing w:line="240" w:lineRule="auto"/>
+              <w:rPr>
+                <w:sz w:val="20"/>
+                <w:szCs w:val="20"/>
+              </w:rPr>
+            </w:pPr>
+            <w:r>
+              <w:rPr>
+                <w:sz w:val="20"/>
+                <w:szCs w:val="20"/>
+              </w:rPr>
+              <w:t>C</w:t>
+            </w:r>
+            <w:r>
+              <w:rPr>
+                <w:sz w:val="20"/>
+                <w:szCs w:val="20"/>
+              </w:rPr>
+              <w:t>all it a testing plan instead</w:t>
+            </w:r>
+          </w:p>
+          <w:p>
+            <w:pPr>
+              <w:pStyle w:val="ListParagraph"/>
+              <w:numPr>
+                <w:ilvl w:val="0"/>
+                <w:numId w:val="8"/>
+              </w:numPr>
+              <w:shd w:val="clear" w:color="auto" w:fill="FFFFFF"/>
+              <w:spacing w:line="240" w:lineRule="auto"/>
+              <w:rPr>
+                <w:sz w:val="20"/>
+                <w:szCs w:val="20"/>
+              </w:rPr>
+            </w:pPr>
+            <w:r>
+              <w:rPr>
+                <w:sz w:val="20"/>
+                <w:szCs w:val="20"/>
+              </w:rPr>
+              <w:t>Focus on unit testing, create a test suite</w:t>
+            </w:r>
+          </w:p>
+          <w:p>
+            <w:pPr>
+              <w:pStyle w:val="ListParagraph"/>
+              <w:numPr>
+                <w:ilvl w:val="0"/>
+                <w:numId w:val="8"/>
+              </w:numPr>
+              <w:shd w:val="clear" w:color="auto" w:fill="FFFFFF"/>
+              <w:spacing w:line="240" w:lineRule="auto"/>
+              <w:rPr>
+                <w:sz w:val="20"/>
+                <w:szCs w:val="20"/>
+              </w:rPr>
+            </w:pPr>
+            <w:r>
+              <w:rPr>
+                <w:sz w:val="20"/>
+                <w:szCs w:val="20"/>
+              </w:rPr>
+              <w:t>Establish specific requirements</w:t>
+            </w:r>
+          </w:p>
+          <w:p>
+            <w:pPr>
+              <w:pStyle w:val="ListParagraph"/>
+              <w:numPr>
+                <w:ilvl w:val="0"/>
+                <w:numId w:val="8"/>
+              </w:numPr>
+              <w:shd w:val="clear" w:color="auto" w:fill="FFFFFF"/>
+              <w:spacing w:line="240" w:lineRule="auto"/>
+              <w:rPr>
+                <w:sz w:val="20"/>
+                <w:szCs w:val="20"/>
+              </w:rPr>
+            </w:pPr>
+            <w:r>
+              <w:rPr>
+                <w:sz w:val="20"/>
+                <w:szCs w:val="20"/>
+              </w:rPr>
+              <w:t>Proposed integration testing; complete prototype</w:t>
+            </w:r>
+          </w:p>
+          <w:p>
+            <w:pPr>
+              <w:pStyle w:val="ListParagraph"/>
+              <w:numPr>
+                <w:ilvl w:val="0"/>
+                <w:numId w:val="8"/>
+              </w:numPr>
+              <w:shd w:val="clear" w:color="auto" w:fill="FFFFFF"/>
+              <w:spacing w:line="240" w:lineRule="auto"/>
+              <w:rPr>
+                <w:sz w:val="20"/>
+                <w:szCs w:val="20"/>
+              </w:rPr>
+            </w:pPr>
+            <w:r>
+              <w:rPr>
+                <w:sz w:val="20"/>
+                <w:szCs w:val="20"/>
+              </w:rPr>
+              <w:t>AGILE development</w:t>
+            </w:r>
+          </w:p>
+          <w:p>
+            <w:pPr>
+              <w:pStyle w:val="ListParagraph"/>
+              <w:numPr>
+                <w:ilvl w:val="0"/>
+                <w:numId w:val="6"/>
+              </w:numPr>
+              <w:shd w:val="clear" w:color="auto" w:fill="FFFFFF"/>
+              <w:spacing w:line="240" w:lineRule="auto"/>
+              <w:rPr>
+                <w:sz w:val="20"/>
+                <w:szCs w:val="20"/>
+              </w:rPr>
+            </w:pPr>
+            <w:r>
+              <w:rPr>
+                <w:sz w:val="20"/>
+                <w:szCs w:val="20"/>
+              </w:rPr>
+              <w:t>Budget template assignment</w:t>
+            </w:r>
+          </w:p>
+          <w:p>
+            <w:pPr>
+              <w:pStyle w:val="ListParagraph"/>
+              <w:numPr>
+                <w:ilvl w:val="0"/>
+                <w:numId w:val="8"/>
+              </w:numPr>
+              <w:shd w:val="clear" w:color="auto" w:fill="FFFFFF"/>
+              <w:spacing w:line="240" w:lineRule="auto"/>
+              <w:rPr>
+                <w:sz w:val="20"/>
+                <w:szCs w:val="20"/>
+              </w:rPr>
+            </w:pPr>
+            <w:r>
+              <w:rPr>
+                <w:sz w:val="20"/>
+                <w:szCs w:val="20"/>
+              </w:rPr>
+              <w:t>Need to keep track of computer systems being used, even if they are free to use</w:t>
+            </w:r>
+          </w:p>
+          <w:p>
+            <w:pPr>
+              <w:pStyle w:val="ListParagraph"/>
+              <w:numPr>
+                <w:ilvl w:val="0"/>
+                <w:numId w:val="8"/>
+              </w:numPr>
+              <w:shd w:val="clear" w:color="auto" w:fill="FFFFFF"/>
+              <w:spacing w:line="240" w:lineRule="auto"/>
+              <w:rPr>
+                <w:sz w:val="20"/>
+                <w:szCs w:val="20"/>
+              </w:rPr>
+            </w:pPr>
+            <w:r>
+              <w:rPr>
+                <w:sz w:val="20"/>
+                <w:szCs w:val="20"/>
+              </w:rPr>
+              <w:t>Personally owned computers, unreal engine is free, plugins we’re using</w:t>
+            </w:r>
+          </w:p>
+          <w:p>
+            <w:pPr>
+              <w:pStyle w:val="ListParagraph"/>
+              <w:numPr>
+                <w:ilvl w:val="0"/>
+                <w:numId w:val="8"/>
+              </w:numPr>
+              <w:shd w:val="clear" w:color="auto" w:fill="FFFFFF"/>
+              <w:spacing w:line="240" w:lineRule="auto"/>
+              <w:rPr>
+                <w:sz w:val="20"/>
+                <w:szCs w:val="20"/>
+              </w:rPr>
+            </w:pPr>
+            <w:r>
+              <w:rPr>
+                <w:sz w:val="20"/>
+                <w:szCs w:val="20"/>
+              </w:rPr>
+              <w:t xml:space="preserve">Check that </w:t>
+            </w:r>
+            <w:proofErr w:type="spellStart"/>
+            <w:r>
+              <w:rPr>
+                <w:sz w:val="20"/>
+                <w:szCs w:val="20"/>
+              </w:rPr>
+              <w:t>modbus</w:t>
+            </w:r>
+            <w:proofErr w:type="spellEnd"/>
+            <w:r>
+              <w:rPr>
+                <w:sz w:val="20"/>
+                <w:szCs w:val="20"/>
+              </w:rPr>
+              <w:t xml:space="preserve"> libraries are open source</w:t>
+            </w:r>
+          </w:p>
+          <w:p>
+            <w:pPr>
+              <w:pStyle w:val="ListParagraph"/>
+              <w:numPr>
+                <w:ilvl w:val="0"/>
+                <w:numId w:val="6"/>
+              </w:numPr>
+              <w:shd w:val="clear" w:color="auto" w:fill="FFFFFF"/>
+              <w:spacing w:line="240" w:lineRule="auto"/>
+              <w:rPr>
+                <w:sz w:val="20"/>
+                <w:szCs w:val="20"/>
+              </w:rPr>
+            </w:pPr>
+            <w:r>
+              <w:rPr>
+                <w:sz w:val="20"/>
+                <w:szCs w:val="20"/>
+              </w:rPr>
+              <w:t>Project scheduling assignment</w:t>
+            </w:r>
+          </w:p>
+          <w:p>
+            <w:pPr>
+              <w:pStyle w:val="ListParagraph"/>
+              <w:numPr>
+                <w:ilvl w:val="0"/>
+                <w:numId w:val="8"/>
+              </w:numPr>
+              <w:shd w:val="clear" w:color="auto" w:fill="FFFFFF"/>
+              <w:spacing w:line="240" w:lineRule="auto"/>
+              <w:rPr>
+                <w:sz w:val="20"/>
+                <w:szCs w:val="20"/>
+              </w:rPr>
+            </w:pPr>
+            <w:r>
+              <w:rPr>
+                <w:sz w:val="20"/>
+                <w:szCs w:val="20"/>
+              </w:rPr>
+              <w:t>Lay the schedule backwards in sprints of one week, max two weeks</w:t>
+            </w:r>
+          </w:p>
+          <w:p>
+            <w:pPr>
+              <w:pStyle w:val="ListParagraph"/>
+              <w:numPr>
+                <w:ilvl w:val="0"/>
+                <w:numId w:val="8"/>
+              </w:numPr>
+              <w:shd w:val="clear" w:color="auto" w:fill="FFFFFF"/>
+              <w:spacing w:line="240" w:lineRule="auto"/>
+              <w:rPr>
+                <w:sz w:val="20"/>
+                <w:szCs w:val="20"/>
+              </w:rPr>
+            </w:pPr>
+            <w:r>
+              <w:rPr>
+                <w:sz w:val="20"/>
+                <w:szCs w:val="20"/>
+              </w:rPr>
+              <w:t>Establish days for poster, demo, integrating, etc.</w:t>
+            </w:r>
+          </w:p>
+          <w:p>
+            <w:pPr>
+              <w:pStyle w:val="ListParagraph"/>
+              <w:numPr>
+                <w:ilvl w:val="0"/>
+                <w:numId w:val="8"/>
+              </w:numPr>
+              <w:shd w:val="clear" w:color="auto" w:fill="FFFFFF"/>
+              <w:spacing w:line="240" w:lineRule="auto"/>
+              <w:rPr>
+                <w:sz w:val="20"/>
+                <w:szCs w:val="20"/>
+              </w:rPr>
+            </w:pPr>
+            <w:r>
+              <w:rPr>
+                <w:sz w:val="20"/>
+                <w:szCs w:val="20"/>
+              </w:rPr>
+              <w:t>Create architectural separations between tasks</w:t>
+            </w:r>
+          </w:p>
+          <w:p>
+            <w:pPr>
+              <w:pStyle w:val="ListParagraph"/>
+              <w:numPr>
+                <w:ilvl w:val="0"/>
+                <w:numId w:val="8"/>
+              </w:numPr>
+              <w:shd w:val="clear" w:color="auto" w:fill="FFFFFF"/>
+              <w:spacing w:line="240" w:lineRule="auto"/>
+              <w:rPr>
+                <w:sz w:val="20"/>
+                <w:szCs w:val="20"/>
+              </w:rPr>
+            </w:pPr>
+            <w:r>
+              <w:rPr>
+                <w:sz w:val="20"/>
+                <w:szCs w:val="20"/>
+              </w:rPr>
+              <w:lastRenderedPageBreak/>
+              <w:t>Figure out the backlog of tasks, revise every week to find out what is doable/better approaches</w:t>
+            </w:r>
+          </w:p>
+          <w:p>
+            <w:pPr>
+              <w:pStyle w:val="ListParagraph"/>
+              <w:numPr>
+                <w:ilvl w:val="0"/>
+                <w:numId w:val="8"/>
+              </w:numPr>
+              <w:shd w:val="clear" w:color="auto" w:fill="FFFFFF"/>
+              <w:spacing w:line="240" w:lineRule="auto"/>
+              <w:rPr>
+                <w:sz w:val="20"/>
+                <w:szCs w:val="20"/>
+              </w:rPr>
+            </w:pPr>
+            <w:r>
+              <w:rPr>
+                <w:sz w:val="20"/>
+                <w:szCs w:val="20"/>
+              </w:rPr>
+              <w:t>A backlog with potential deadlines</w:t>
+            </w:r>
+          </w:p>
+          <w:p>
+            <w:pPr>
+              <w:pStyle w:val="ListParagraph"/>
+              <w:numPr>
+                <w:ilvl w:val="0"/>
+                <w:numId w:val="8"/>
+              </w:numPr>
+              <w:shd w:val="clear" w:color="auto" w:fill="FFFFFF"/>
+              <w:spacing w:line="240" w:lineRule="auto"/>
+              <w:rPr>
+                <w:sz w:val="20"/>
+                <w:szCs w:val="20"/>
+              </w:rPr>
+            </w:pPr>
+            <w:r>
+              <w:rPr>
+                <w:sz w:val="20"/>
+                <w:szCs w:val="20"/>
+              </w:rPr>
+              <w:t>Modbus integration, connecting devices, communication protocols; testing time as well</w:t>
+            </w:r>
+          </w:p>
+          <w:p>
+            <w:pPr>
+              <w:pStyle w:val="ListParagraph"/>
+              <w:numPr>
+                <w:ilvl w:val="0"/>
+                <w:numId w:val="8"/>
+              </w:numPr>
+              <w:shd w:val="clear" w:color="auto" w:fill="FFFFFF"/>
+              <w:spacing w:line="240" w:lineRule="auto"/>
+              <w:rPr>
+                <w:sz w:val="20"/>
+                <w:szCs w:val="20"/>
+              </w:rPr>
+            </w:pPr>
+            <w:r>
+              <w:rPr>
+                <w:sz w:val="20"/>
+                <w:szCs w:val="20"/>
+              </w:rPr>
+              <w:t>Backlog</w:t>
+            </w:r>
+            <w:proofErr w:type="gramStart"/>
+            <w:r>
+              <w:rPr>
+                <w:sz w:val="20"/>
+                <w:szCs w:val="20"/>
+              </w:rPr>
+              <w:t>:  document</w:t>
+            </w:r>
+            <w:proofErr w:type="gramEnd"/>
+            <w:r>
+              <w:rPr>
+                <w:sz w:val="20"/>
+                <w:szCs w:val="20"/>
+              </w:rPr>
+              <w:t xml:space="preserve"> deliverables, </w:t>
+            </w:r>
+          </w:p>
+          <w:p>
+            <w:pPr>
+              <w:numPr>
+                <w:ilvl w:val="0"/>
+                <w:numId w:val="6"/>
+              </w:numPr>
+              <w:shd w:val="clear" w:color="auto" w:fill="FFFFFF"/>
+              <w:spacing w:line="240" w:lineRule="auto"/>
+              <w:rPr>
+                <w:sz w:val="20"/>
+                <w:szCs w:val="20"/>
+              </w:rPr>
+            </w:pPr>
+            <w:r>
+              <w:rPr>
+                <w:sz w:val="20"/>
+                <w:szCs w:val="20"/>
+              </w:rPr>
+              <w:t xml:space="preserve">Snapshot day 1: </w:t>
+            </w:r>
+          </w:p>
+          <w:p>
+            <w:pPr>
+              <w:pStyle w:val="ListParagraph"/>
+              <w:numPr>
+                <w:ilvl w:val="0"/>
+                <w:numId w:val="8"/>
+              </w:numPr>
+              <w:shd w:val="clear" w:color="auto" w:fill="FFFFFF"/>
+              <w:spacing w:line="240" w:lineRule="auto"/>
+              <w:rPr>
+                <w:sz w:val="20"/>
+                <w:szCs w:val="20"/>
+              </w:rPr>
+            </w:pPr>
+            <w:r>
+              <w:rPr>
+                <w:sz w:val="20"/>
+                <w:szCs w:val="20"/>
+              </w:rPr>
+              <w:t>Oct 27</w:t>
+            </w:r>
+            <w:r>
+              <w:rPr>
+                <w:sz w:val="20"/>
+                <w:szCs w:val="20"/>
+                <w:vertAlign w:val="superscript"/>
+              </w:rPr>
+              <w:t>th</w:t>
+            </w:r>
+            <w:r>
+              <w:rPr>
+                <w:sz w:val="20"/>
+                <w:szCs w:val="20"/>
+              </w:rPr>
+              <w:t xml:space="preserve">, in unreal, receive data from network </w:t>
+            </w:r>
+            <w:proofErr w:type="gramStart"/>
+            <w:r>
+              <w:rPr>
+                <w:sz w:val="20"/>
+                <w:szCs w:val="20"/>
+              </w:rPr>
+              <w:t>condition</w:t>
+            </w:r>
+            <w:proofErr w:type="gramEnd"/>
+            <w:r>
+              <w:rPr>
+                <w:sz w:val="20"/>
+                <w:szCs w:val="20"/>
+              </w:rPr>
+              <w:t xml:space="preserve"> to make sure communication is established</w:t>
+            </w:r>
+          </w:p>
+          <w:p>
+            <w:pPr>
+              <w:pStyle w:val="ListParagraph"/>
+              <w:numPr>
+                <w:ilvl w:val="0"/>
+                <w:numId w:val="8"/>
+              </w:numPr>
+              <w:shd w:val="clear" w:color="auto" w:fill="FFFFFF"/>
+              <w:spacing w:line="240" w:lineRule="auto"/>
+              <w:rPr>
+                <w:sz w:val="20"/>
+                <w:szCs w:val="20"/>
+              </w:rPr>
+            </w:pPr>
+            <w:r>
+              <w:rPr>
+                <w:sz w:val="20"/>
+                <w:szCs w:val="20"/>
+              </w:rPr>
+              <w:t xml:space="preserve">Compile the project and create our own blueprints.  Can </w:t>
+            </w:r>
+            <w:proofErr w:type="spellStart"/>
+            <w:r>
+              <w:rPr>
+                <w:sz w:val="20"/>
+                <w:szCs w:val="20"/>
+              </w:rPr>
+              <w:t>modbus</w:t>
+            </w:r>
+            <w:proofErr w:type="spellEnd"/>
+            <w:r>
+              <w:rPr>
+                <w:sz w:val="20"/>
+                <w:szCs w:val="20"/>
+              </w:rPr>
+              <w:t xml:space="preserve"> grab data from both sides and translate that information.</w:t>
+            </w:r>
+          </w:p>
+          <w:p>
+            <w:pPr>
+              <w:pStyle w:val="ListParagraph"/>
+              <w:numPr>
+                <w:ilvl w:val="0"/>
+                <w:numId w:val="8"/>
+              </w:numPr>
+              <w:shd w:val="clear" w:color="auto" w:fill="FFFFFF"/>
+              <w:spacing w:line="240" w:lineRule="auto"/>
+              <w:rPr>
+                <w:sz w:val="20"/>
+                <w:szCs w:val="20"/>
+              </w:rPr>
+            </w:pPr>
+            <w:r>
+              <w:rPr>
+                <w:sz w:val="20"/>
+                <w:szCs w:val="20"/>
+              </w:rPr>
+              <w:t xml:space="preserve">Need C++ </w:t>
+            </w:r>
+            <w:proofErr w:type="spellStart"/>
+            <w:r>
+              <w:rPr>
+                <w:sz w:val="20"/>
+                <w:szCs w:val="20"/>
+              </w:rPr>
+              <w:t>modbus</w:t>
+            </w:r>
+            <w:proofErr w:type="spellEnd"/>
+            <w:r>
+              <w:rPr>
+                <w:sz w:val="20"/>
+                <w:szCs w:val="20"/>
+              </w:rPr>
+              <w:t xml:space="preserve"> implementation</w:t>
+            </w:r>
+          </w:p>
+          <w:p>
+            <w:pPr>
+              <w:pStyle w:val="ListParagraph"/>
+              <w:numPr>
+                <w:ilvl w:val="0"/>
+                <w:numId w:val="8"/>
+              </w:numPr>
+              <w:shd w:val="clear" w:color="auto" w:fill="FFFFFF"/>
+              <w:spacing w:line="240" w:lineRule="auto"/>
+              <w:rPr>
+                <w:sz w:val="20"/>
+                <w:szCs w:val="20"/>
+              </w:rPr>
+            </w:pPr>
+            <w:r>
+              <w:rPr>
+                <w:sz w:val="20"/>
+                <w:szCs w:val="20"/>
+              </w:rPr>
+              <w:t xml:space="preserve">Modbus lib, micro </w:t>
+            </w:r>
+            <w:proofErr w:type="spellStart"/>
+            <w:r>
+              <w:rPr>
+                <w:sz w:val="20"/>
+                <w:szCs w:val="20"/>
+              </w:rPr>
+              <w:t>modbus</w:t>
+            </w:r>
+            <w:proofErr w:type="spellEnd"/>
+            <w:r>
+              <w:rPr>
+                <w:sz w:val="20"/>
+                <w:szCs w:val="20"/>
+              </w:rPr>
+              <w:t xml:space="preserve"> (library dependencies are better for micro </w:t>
+            </w:r>
+            <w:proofErr w:type="spellStart"/>
+            <w:r>
+              <w:rPr>
+                <w:sz w:val="20"/>
+                <w:szCs w:val="20"/>
+              </w:rPr>
+              <w:t>modbus</w:t>
+            </w:r>
+            <w:proofErr w:type="spellEnd"/>
+            <w:r>
+              <w:rPr>
+                <w:sz w:val="20"/>
+                <w:szCs w:val="20"/>
+              </w:rPr>
+              <w:t>)</w:t>
+            </w:r>
+          </w:p>
+          <w:p>
+            <w:pPr>
+              <w:pStyle w:val="ListParagraph"/>
+              <w:numPr>
+                <w:ilvl w:val="0"/>
+                <w:numId w:val="8"/>
+              </w:numPr>
+              <w:shd w:val="clear" w:color="auto" w:fill="FFFFFF"/>
+              <w:spacing w:line="240" w:lineRule="auto"/>
+              <w:rPr>
                 <w:color w:val="222222"/>
                 <w:sz w:val="20"/>
                 <w:szCs w:val="20"/>
               </w:rPr>
             </w:pPr>
+            <w:r>
+              <w:rPr>
+                <w:sz w:val="20"/>
+                <w:szCs w:val="20"/>
+              </w:rPr>
+              <w:t>MIT licensed</w:t>
+            </w:r>
+            <w:r>
+              <w:rPr>
+                <w:sz w:val="20"/>
+                <w:szCs w:val="20"/>
+              </w:rPr>
+              <w:t>, or MIT friendly licenses</w:t>
+            </w:r>
+          </w:p>
+          <w:p>
+            <w:pPr>
+              <w:pStyle w:val="ListParagraph"/>
+              <w:numPr>
+                <w:ilvl w:val="0"/>
+                <w:numId w:val="8"/>
+              </w:numPr>
+              <w:shd w:val="clear" w:color="auto" w:fill="FFFFFF"/>
+              <w:spacing w:line="240" w:lineRule="auto"/>
+              <w:rPr>
+                <w:color w:val="222222"/>
+                <w:sz w:val="20"/>
+                <w:szCs w:val="20"/>
+              </w:rPr>
+            </w:pPr>
+            <w:r>
+              <w:rPr>
+                <w:color w:val="222222"/>
+                <w:sz w:val="20"/>
+                <w:szCs w:val="20"/>
+              </w:rPr>
+              <w:t>Can’t use LGPL, not compatible with Unreal code</w:t>
+            </w:r>
+          </w:p>
+          <w:p>
+            <w:pPr>
+              <w:widowControl w:val="0"/>
+              <w:rPr>
+                <w:color w:val="222222"/>
+                <w:sz w:val="20"/>
+                <w:szCs w:val="20"/>
+              </w:rPr>
+            </w:pPr>
+          </w:p>
+          <w:p>
+            <w:pPr>
+              <w:widowControl w:val="0"/>
+              <w:rPr>
+                <w:color w:val="222222"/>
+                <w:sz w:val="20"/>
+                <w:szCs w:val="20"/>
+              </w:rPr>
+            </w:pPr>
+          </w:p>
+          <w:p>
+            <w:pPr>
+              <w:pStyle w:val="ListParagraph"/>
+              <w:widowControl w:val="0"/>
+              <w:numPr>
+                <w:ilvl w:val="0"/>
+                <w:numId w:val="6"/>
+              </w:numPr>
+              <w:rPr>
+                <w:color w:val="222222"/>
+                <w:sz w:val="20"/>
+                <w:szCs w:val="20"/>
+              </w:rPr>
+            </w:pPr>
+            <w:r>
+              <w:rPr>
+                <w:color w:val="222222"/>
+                <w:sz w:val="20"/>
+                <w:szCs w:val="20"/>
+              </w:rPr>
+              <w:t>Action Items for Next Week:</w:t>
+            </w:r>
+          </w:p>
+          <w:p>
+            <w:pPr>
+              <w:pStyle w:val="ListParagraph"/>
+              <w:widowControl w:val="0"/>
+              <w:numPr>
+                <w:ilvl w:val="0"/>
+                <w:numId w:val="8"/>
+              </w:numPr>
+              <w:rPr>
+                <w:color w:val="222222"/>
+                <w:sz w:val="20"/>
+                <w:szCs w:val="20"/>
+              </w:rPr>
+            </w:pPr>
+            <w:r>
+              <w:rPr>
+                <w:color w:val="222222"/>
+                <w:sz w:val="20"/>
+                <w:szCs w:val="20"/>
+              </w:rPr>
+              <w:t>Build the backlog for the schedule, put potential dates on it, separate it into independent work areas</w:t>
+            </w:r>
+          </w:p>
+          <w:p>
+            <w:pPr>
+              <w:pStyle w:val="ListParagraph"/>
+              <w:widowControl w:val="0"/>
+              <w:numPr>
+                <w:ilvl w:val="0"/>
+                <w:numId w:val="8"/>
+              </w:numPr>
+              <w:rPr>
+                <w:color w:val="222222"/>
+                <w:sz w:val="20"/>
+                <w:szCs w:val="20"/>
+              </w:rPr>
+            </w:pPr>
+            <w:r>
+              <w:rPr>
+                <w:color w:val="222222"/>
+                <w:sz w:val="20"/>
+                <w:szCs w:val="20"/>
+              </w:rPr>
+              <w:t>Come up with a Gantt chart/list during the team meeting</w:t>
+            </w:r>
+          </w:p>
+          <w:p>
+            <w:pPr>
+              <w:pStyle w:val="ListParagraph"/>
+              <w:widowControl w:val="0"/>
+              <w:numPr>
+                <w:ilvl w:val="0"/>
+                <w:numId w:val="8"/>
+              </w:numPr>
+              <w:rPr>
+                <w:color w:val="222222"/>
+                <w:sz w:val="20"/>
+                <w:szCs w:val="20"/>
+              </w:rPr>
+            </w:pPr>
+            <w:r>
+              <w:rPr>
+                <w:color w:val="222222"/>
+                <w:sz w:val="20"/>
+                <w:szCs w:val="20"/>
+              </w:rPr>
+              <w:t>For Sunday</w:t>
+            </w:r>
+            <w:proofErr w:type="gramStart"/>
+            <w:r>
+              <w:rPr>
+                <w:color w:val="222222"/>
+                <w:sz w:val="20"/>
+                <w:szCs w:val="20"/>
+              </w:rPr>
+              <w:t>:  come</w:t>
+            </w:r>
+            <w:proofErr w:type="gramEnd"/>
+            <w:r>
+              <w:rPr>
+                <w:color w:val="222222"/>
+                <w:sz w:val="20"/>
+                <w:szCs w:val="20"/>
+              </w:rPr>
+              <w:t xml:space="preserve"> up with some items for the backlog</w:t>
+            </w:r>
+          </w:p>
+          <w:p>
+            <w:pPr>
+              <w:pStyle w:val="ListParagraph"/>
+              <w:widowControl w:val="0"/>
+              <w:numPr>
+                <w:ilvl w:val="0"/>
+                <w:numId w:val="8"/>
+              </w:numPr>
+              <w:rPr>
+                <w:color w:val="222222"/>
+                <w:sz w:val="20"/>
+                <w:szCs w:val="20"/>
+              </w:rPr>
+            </w:pPr>
+            <w:r>
+              <w:rPr>
+                <w:color w:val="222222"/>
+                <w:sz w:val="20"/>
+                <w:szCs w:val="20"/>
+              </w:rPr>
+              <w:t>How to separate out tasks?  Need list of tasks that are separate enough from one another.</w:t>
+            </w:r>
+          </w:p>
+          <w:p>
+            <w:pPr>
+              <w:pStyle w:val="ListParagraph"/>
+              <w:widowControl w:val="0"/>
+              <w:numPr>
+                <w:ilvl w:val="0"/>
+                <w:numId w:val="8"/>
+              </w:numPr>
+              <w:rPr>
+                <w:color w:val="222222"/>
+                <w:sz w:val="20"/>
+                <w:szCs w:val="20"/>
+              </w:rPr>
+            </w:pPr>
+            <w:r>
+              <w:rPr>
+                <w:color w:val="222222"/>
+                <w:sz w:val="20"/>
+                <w:szCs w:val="20"/>
+              </w:rPr>
+              <w:t xml:space="preserve">Keep scheduling/Gantt charting </w:t>
+            </w:r>
+            <w:proofErr w:type="gramStart"/>
+            <w:r>
+              <w:rPr>
+                <w:color w:val="222222"/>
+                <w:sz w:val="20"/>
+                <w:szCs w:val="20"/>
+              </w:rPr>
+              <w:t>fairly high</w:t>
+            </w:r>
+            <w:proofErr w:type="gramEnd"/>
+            <w:r>
+              <w:rPr>
+                <w:color w:val="222222"/>
+                <w:sz w:val="20"/>
+                <w:szCs w:val="20"/>
+              </w:rPr>
+              <w:t xml:space="preserve"> level, it will be out of date often, new decisions each week on what needs to move the project forward</w:t>
+            </w:r>
+          </w:p>
+          <w:p>
+            <w:pPr>
+              <w:pStyle w:val="ListParagraph"/>
+              <w:widowControl w:val="0"/>
+              <w:numPr>
+                <w:ilvl w:val="0"/>
+                <w:numId w:val="8"/>
+              </w:numPr>
+              <w:rPr>
+                <w:color w:val="222222"/>
+                <w:sz w:val="20"/>
+                <w:szCs w:val="20"/>
+              </w:rPr>
+            </w:pPr>
+            <w:r>
+              <w:rPr>
+                <w:color w:val="222222"/>
+                <w:sz w:val="20"/>
+                <w:szCs w:val="20"/>
+              </w:rPr>
+              <w:t xml:space="preserve">For each big architectural piece, we need list of things that need to be done.  Backlog </w:t>
+            </w:r>
+            <w:proofErr w:type="gramStart"/>
+            <w:r>
+              <w:rPr>
+                <w:color w:val="222222"/>
+                <w:sz w:val="20"/>
+                <w:szCs w:val="20"/>
+              </w:rPr>
+              <w:t>has to</w:t>
+            </w:r>
+            <w:proofErr w:type="gramEnd"/>
+            <w:r>
+              <w:rPr>
+                <w:color w:val="222222"/>
+                <w:sz w:val="20"/>
+                <w:szCs w:val="20"/>
+              </w:rPr>
+              <w:t xml:space="preserve"> be scratch work as the small tasks will constantly change based on need.</w:t>
+            </w:r>
           </w:p>
           <w:p>
             <w:pPr>
@@ -1050,6 +2045,7 @@
                 <w:sz w:val="20"/>
                 <w:szCs w:val="20"/>
               </w:rPr>
+              <w:lastRenderedPageBreak/>
               <w:t>Other Topics (</w:t>
             </w:r>
             <w:r>
@@ -1071,11 +2067,241 @@
           </w:p>
           <w:p>
             <w:pPr>
-              <w:shd w:val="clear" w:color="auto" w:fill="FFFFFF"/>
-              <w:spacing w:line="240" w:lineRule="auto"/>
-              <w:ind w:left="1440"/>
-              <w:rPr>
+              <w:pStyle w:val="ListParagraph"/>
+              <w:widowControl w:val="0"/>
+              <w:numPr>
+                <w:ilvl w:val="0"/>
+                <w:numId w:val="8"/>
+              </w:numPr>
+              <w:pBdr>
+                <w:top w:val="nil"/>
+                <w:left w:val="nil"/>
+                <w:bottom w:val="nil"/>
+                <w:right w:val="nil"/>
+                <w:between w:val="nil"/>
+              </w:pBdr>
+              <w:spacing w:before="200"/>
+              <w:rPr>
+                <w:bCs/>
                 <w:color w:val="222222"/>
+                <w:sz w:val="20"/>
+                <w:szCs w:val="20"/>
+              </w:rPr>
+            </w:pPr>
+            <w:r>
+              <w:rPr>
+                <w:bCs/>
+                <w:sz w:val="20"/>
+                <w:szCs w:val="20"/>
+              </w:rPr>
+              <w:t>Does Unreal have built in unit testing?</w:t>
+            </w:r>
+          </w:p>
+          <w:p>
+            <w:pPr>
+              <w:pStyle w:val="ListParagraph"/>
+              <w:widowControl w:val="0"/>
+              <w:numPr>
+                <w:ilvl w:val="0"/>
+                <w:numId w:val="8"/>
+              </w:numPr>
+              <w:pBdr>
+                <w:top w:val="nil"/>
+                <w:left w:val="nil"/>
+                <w:bottom w:val="nil"/>
+                <w:right w:val="nil"/>
+                <w:between w:val="nil"/>
+              </w:pBdr>
+              <w:spacing w:before="200"/>
+              <w:rPr>
+                <w:color w:val="222222"/>
+                <w:sz w:val="20"/>
+                <w:szCs w:val="20"/>
+              </w:rPr>
+            </w:pPr>
+            <w:r>
+              <w:rPr>
+                <w:color w:val="222222"/>
+                <w:sz w:val="20"/>
+                <w:szCs w:val="20"/>
+              </w:rPr>
+              <w:t xml:space="preserve">Yes, but it considered corporate and better for big platforms.  Not </w:t>
+            </w:r>
+            <w:proofErr w:type="gramStart"/>
+            <w:r>
+              <w:rPr>
+                <w:color w:val="222222"/>
+                <w:sz w:val="20"/>
+                <w:szCs w:val="20"/>
+              </w:rPr>
+              <w:t>really much</w:t>
+            </w:r>
+            <w:proofErr w:type="gramEnd"/>
+            <w:r>
+              <w:rPr>
+                <w:color w:val="222222"/>
+                <w:sz w:val="20"/>
+                <w:szCs w:val="20"/>
+              </w:rPr>
+              <w:t xml:space="preserve"> for client/developer side.</w:t>
+            </w:r>
+          </w:p>
+          <w:p>
+            <w:pPr>
+              <w:pStyle w:val="ListParagraph"/>
+              <w:widowControl w:val="0"/>
+              <w:numPr>
+                <w:ilvl w:val="0"/>
+                <w:numId w:val="8"/>
+              </w:numPr>
+              <w:pBdr>
+                <w:top w:val="nil"/>
+                <w:left w:val="nil"/>
+                <w:bottom w:val="nil"/>
+                <w:right w:val="nil"/>
+                <w:between w:val="nil"/>
+              </w:pBdr>
+              <w:spacing w:before="200"/>
+              <w:rPr>
+                <w:color w:val="222222"/>
+                <w:sz w:val="20"/>
+                <w:szCs w:val="20"/>
+              </w:rPr>
+            </w:pPr>
+          </w:p>
+          <w:p>
+            <w:pPr>
+              <w:pStyle w:val="ListParagraph"/>
+              <w:widowControl w:val="0"/>
+              <w:numPr>
+                <w:ilvl w:val="0"/>
+                <w:numId w:val="8"/>
+              </w:numPr>
+              <w:pBdr>
+                <w:top w:val="nil"/>
+                <w:left w:val="nil"/>
+                <w:bottom w:val="nil"/>
+                <w:right w:val="nil"/>
+                <w:between w:val="nil"/>
+              </w:pBdr>
+              <w:spacing w:before="200"/>
+              <w:rPr>
+                <w:color w:val="222222"/>
+                <w:sz w:val="20"/>
+                <w:szCs w:val="20"/>
+              </w:rPr>
+            </w:pPr>
+            <w:r>
+              <w:rPr>
+                <w:color w:val="222222"/>
+                <w:sz w:val="20"/>
+                <w:szCs w:val="20"/>
+              </w:rPr>
+              <w:t>Need to test C++ code the most, needs to be unit tested separately</w:t>
+            </w:r>
+          </w:p>
+          <w:p>
+            <w:pPr>
+              <w:pStyle w:val="ListParagraph"/>
+              <w:widowControl w:val="0"/>
+              <w:numPr>
+                <w:ilvl w:val="0"/>
+                <w:numId w:val="8"/>
+              </w:numPr>
+              <w:pBdr>
+                <w:top w:val="nil"/>
+                <w:left w:val="nil"/>
+                <w:bottom w:val="nil"/>
+                <w:right w:val="nil"/>
+                <w:between w:val="nil"/>
+              </w:pBdr>
+              <w:spacing w:before="200"/>
+              <w:rPr>
+                <w:color w:val="222222"/>
+                <w:sz w:val="20"/>
+                <w:szCs w:val="20"/>
+              </w:rPr>
+            </w:pPr>
+            <w:r>
+              <w:rPr>
+                <w:color w:val="222222"/>
+                <w:sz w:val="20"/>
+                <w:szCs w:val="20"/>
+              </w:rPr>
+              <w:t>Any function you can test with C++ can be integrated into Blueprints</w:t>
+            </w:r>
+          </w:p>
+          <w:p>
+            <w:pPr>
+              <w:pStyle w:val="ListParagraph"/>
+              <w:widowControl w:val="0"/>
+              <w:numPr>
+                <w:ilvl w:val="0"/>
+                <w:numId w:val="8"/>
+              </w:numPr>
+              <w:pBdr>
+                <w:top w:val="nil"/>
+                <w:left w:val="nil"/>
+                <w:bottom w:val="nil"/>
+                <w:right w:val="nil"/>
+                <w:between w:val="nil"/>
+              </w:pBdr>
+              <w:spacing w:before="200"/>
+              <w:rPr>
+                <w:color w:val="222222"/>
+                <w:sz w:val="20"/>
+                <w:szCs w:val="20"/>
+              </w:rPr>
+            </w:pPr>
+          </w:p>
+          <w:p>
+            <w:pPr>
+              <w:pStyle w:val="ListParagraph"/>
+              <w:widowControl w:val="0"/>
+              <w:numPr>
+                <w:ilvl w:val="0"/>
+                <w:numId w:val="8"/>
+              </w:numPr>
+              <w:pBdr>
+                <w:top w:val="nil"/>
+                <w:left w:val="nil"/>
+                <w:bottom w:val="nil"/>
+                <w:right w:val="nil"/>
+                <w:between w:val="nil"/>
+              </w:pBdr>
+              <w:spacing w:before="200"/>
+              <w:rPr>
+                <w:color w:val="222222"/>
+                <w:sz w:val="20"/>
+                <w:szCs w:val="20"/>
+              </w:rPr>
+            </w:pPr>
+          </w:p>
+        </w:tc>
+      </w:tr>
+      <w:tr>
+        <w:trPr>
+          <w:trHeight w:val="240"/>
+        </w:trPr>
+        <w:tc>
+          <w:tcPr>
+            <w:tcW w:w="10800" w:type="dxa"/>
+            <w:vAlign w:val="bottom"/>
+          </w:tcPr>
+          <w:p>
+            <w:pPr>
+              <w:widowControl w:val="0"/>
+              <w:pBdr>
+                <w:top w:val="nil"/>
+                <w:left w:val="nil"/>
+                <w:bottom w:val="nil"/>
+                <w:right w:val="nil"/>
+                <w:between w:val="nil"/>
+              </w:pBdr>
+              <w:spacing w:before="200"/>
+              <w:ind w:left="450"/>
+              <w:rPr>
+                <w:b/>
                 <w:sz w:val="20"/>
                 <w:szCs w:val="20"/>
               </w:rPr>
@@ -1490,13 +2716,7 @@
             </w:rPr>
           </w:pPr>
           <w:r>
-            <w:t>06</w:t>
-          </w:r>
-          <w:r>
-            <w:t>:</w:t>
-          </w:r>
-          <w:r>
-            <w:t>00</w:t>
+            <w:t>05:45</w:t>
           </w:r>
           <w:r>
             <w:t xml:space="preserve"> </w:t>
@@ -1504,6 +2724,7 @@
           <w:r>
             <w:t xml:space="preserve">PM to </w:t>
           </w:r>
+          <w:proofErr w:type="gramStart"/>
           <w:r>
             <w:t>06</w:t>
           </w:r>
@@ -1513,6 +2734,7 @@
           <w:r>
             <w:t>XX</w:t>
           </w:r>
+          <w:proofErr w:type="gramEnd"/>
           <w:r>
             <w:t xml:space="preserve"> PM</w:t>
           </w:r>

</xml_diff>